<commit_message>
Explain interval on testing report
</commit_message>
<xml_diff>
--- a/reports/student2/Entregable4/Informe de Pruebas tomhuecal.docx
+++ b/reports/student2/Entregable4/Informe de Pruebas tomhuecal.docx
@@ -70,6 +70,7 @@
           <w:szCs w:val="36"/>
         </w:rPr>
       </w:pPr>
+      <w:proofErr w:type="spellStart"/>
       <w:r>
         <w:rPr>
           <w:rFonts w:ascii="Arial Narrow" w:eastAsia="Arial Narrow" w:hAnsi="Arial Narrow" w:cs="Arial Narrow"/>
@@ -79,6 +80,7 @@
         </w:rPr>
         <w:t>Testing</w:t>
       </w:r>
+      <w:proofErr w:type="spellEnd"/>
     </w:p>
     <w:p>
       <w:pPr>
@@ -1953,13 +1955,23 @@
                 <w:szCs w:val="24"/>
               </w:rPr>
             </w:pPr>
+            <w:proofErr w:type="spellStart"/>
             <w:r>
               <w:rPr>
                 <w:rFonts w:ascii="Arial Narrow" w:eastAsia="Arial Narrow" w:hAnsi="Arial Narrow" w:cs="Arial Narrow"/>
                 <w:sz w:val="24"/>
                 <w:szCs w:val="24"/>
               </w:rPr>
-              <w:t>Hotfix del documento para la segunda entrega a producción</w:t>
+              <w:t>Hotfix</w:t>
+            </w:r>
+            <w:proofErr w:type="spellEnd"/>
+            <w:r>
+              <w:rPr>
+                <w:rFonts w:ascii="Arial Narrow" w:eastAsia="Arial Narrow" w:hAnsi="Arial Narrow" w:cs="Arial Narrow"/>
+                <w:sz w:val="24"/>
+                <w:szCs w:val="24"/>
+              </w:rPr>
+              <w:t xml:space="preserve"> del documento para la segunda entrega a producción</w:t>
             </w:r>
           </w:p>
         </w:tc>
@@ -2190,7 +2202,35 @@
         <w:rPr>
           <w:rFonts w:ascii="Montserrat" w:eastAsia="Montserrat" w:hAnsi="Montserrat" w:cs="Montserrat"/>
         </w:rPr>
-        <w:t>se ha llevado a cabo la refactorización de los tests incluyendo más pruebas, incluyendo además aquel flujo en el que se producía el error que nos reporto el cliente en el primer entregable.</w:t>
+        <w:t xml:space="preserve">se ha llevado a cabo la refactorización de los </w:t>
+      </w:r>
+      <w:proofErr w:type="spellStart"/>
+      <w:r>
+        <w:rPr>
+          <w:rFonts w:ascii="Montserrat" w:eastAsia="Montserrat" w:hAnsi="Montserrat" w:cs="Montserrat"/>
+        </w:rPr>
+        <w:t>tests</w:t>
+      </w:r>
+      <w:proofErr w:type="spellEnd"/>
+      <w:r>
+        <w:rPr>
+          <w:rFonts w:ascii="Montserrat" w:eastAsia="Montserrat" w:hAnsi="Montserrat" w:cs="Montserrat"/>
+        </w:rPr>
+        <w:t xml:space="preserve"> incluyendo más pruebas, incluyendo además aquel flujo en el que se producía el error que nos </w:t>
+      </w:r>
+      <w:proofErr w:type="spellStart"/>
+      <w:r>
+        <w:rPr>
+          <w:rFonts w:ascii="Montserrat" w:eastAsia="Montserrat" w:hAnsi="Montserrat" w:cs="Montserrat"/>
+        </w:rPr>
+        <w:t>reporto</w:t>
+      </w:r>
+      <w:proofErr w:type="spellEnd"/>
+      <w:r>
+        <w:rPr>
+          <w:rFonts w:ascii="Montserrat" w:eastAsia="Montserrat" w:hAnsi="Montserrat" w:cs="Montserrat"/>
+        </w:rPr>
+        <w:t xml:space="preserve"> el cliente en el primer entregable.</w:t>
       </w:r>
     </w:p>
     <w:p>
@@ -2298,7 +2338,35 @@
         <w:rPr>
           <w:rFonts w:ascii="Montserrat" w:eastAsia="Montserrat" w:hAnsi="Montserrat" w:cs="Montserrat"/>
         </w:rPr>
-        <w:t>Se toma la decisión de no implementar ningún índice en el framework ya que este crea los índices por ids y atributos de navegación automáticamente</w:t>
+        <w:t xml:space="preserve">Se toma la decisión de no implementar ningún índice en el </w:t>
+      </w:r>
+      <w:proofErr w:type="spellStart"/>
+      <w:r>
+        <w:rPr>
+          <w:rFonts w:ascii="Montserrat" w:eastAsia="Montserrat" w:hAnsi="Montserrat" w:cs="Montserrat"/>
+        </w:rPr>
+        <w:t>framework</w:t>
+      </w:r>
+      <w:proofErr w:type="spellEnd"/>
+      <w:r>
+        <w:rPr>
+          <w:rFonts w:ascii="Montserrat" w:eastAsia="Montserrat" w:hAnsi="Montserrat" w:cs="Montserrat"/>
+        </w:rPr>
+        <w:t xml:space="preserve"> ya que este crea los índices por </w:t>
+      </w:r>
+      <w:proofErr w:type="spellStart"/>
+      <w:r>
+        <w:rPr>
+          <w:rFonts w:ascii="Montserrat" w:eastAsia="Montserrat" w:hAnsi="Montserrat" w:cs="Montserrat"/>
+        </w:rPr>
+        <w:t>ids</w:t>
+      </w:r>
+      <w:proofErr w:type="spellEnd"/>
+      <w:r>
+        <w:rPr>
+          <w:rFonts w:ascii="Montserrat" w:eastAsia="Montserrat" w:hAnsi="Montserrat" w:cs="Montserrat"/>
+        </w:rPr>
+        <w:t xml:space="preserve"> y atributos de navegación automáticamente</w:t>
       </w:r>
     </w:p>
     <w:p>
@@ -2319,7 +2387,97 @@
           <w:sz w:val="22"/>
           <w:szCs w:val="22"/>
         </w:rPr>
-        <w:t>Algunas cosas pueden salir en amarillo como el assert object  != null o validaciones authenticated que ya lo haga el framework por detrás.</w:t>
+        <w:t xml:space="preserve">Algunas cosas pueden salir en amarillo como el </w:t>
+      </w:r>
+      <w:proofErr w:type="spellStart"/>
+      <w:r>
+        <w:rPr>
+          <w:rFonts w:ascii="Montserrat" w:eastAsia="Montserrat" w:hAnsi="Montserrat" w:cs="Montserrat"/>
+          <w:sz w:val="22"/>
+          <w:szCs w:val="22"/>
+        </w:rPr>
+        <w:t>assert</w:t>
+      </w:r>
+      <w:proofErr w:type="spellEnd"/>
+      <w:r>
+        <w:rPr>
+          <w:rFonts w:ascii="Montserrat" w:eastAsia="Montserrat" w:hAnsi="Montserrat" w:cs="Montserrat"/>
+          <w:sz w:val="22"/>
+          <w:szCs w:val="22"/>
+        </w:rPr>
+        <w:t xml:space="preserve"> </w:t>
+      </w:r>
+      <w:proofErr w:type="spellStart"/>
+      <w:r>
+        <w:rPr>
+          <w:rFonts w:ascii="Montserrat" w:eastAsia="Montserrat" w:hAnsi="Montserrat" w:cs="Montserrat"/>
+          <w:sz w:val="22"/>
+          <w:szCs w:val="22"/>
+        </w:rPr>
+        <w:t>object</w:t>
+      </w:r>
+      <w:proofErr w:type="spellEnd"/>
+      <w:r>
+        <w:rPr>
+          <w:rFonts w:ascii="Montserrat" w:eastAsia="Montserrat" w:hAnsi="Montserrat" w:cs="Montserrat"/>
+          <w:sz w:val="22"/>
+          <w:szCs w:val="22"/>
+        </w:rPr>
+        <w:t xml:space="preserve">  != </w:t>
+      </w:r>
+      <w:proofErr w:type="spellStart"/>
+      <w:r>
+        <w:rPr>
+          <w:rFonts w:ascii="Montserrat" w:eastAsia="Montserrat" w:hAnsi="Montserrat" w:cs="Montserrat"/>
+          <w:sz w:val="22"/>
+          <w:szCs w:val="22"/>
+        </w:rPr>
+        <w:t>null</w:t>
+      </w:r>
+      <w:proofErr w:type="spellEnd"/>
+      <w:r>
+        <w:rPr>
+          <w:rFonts w:ascii="Montserrat" w:eastAsia="Montserrat" w:hAnsi="Montserrat" w:cs="Montserrat"/>
+          <w:sz w:val="22"/>
+          <w:szCs w:val="22"/>
+        </w:rPr>
+        <w:t xml:space="preserve"> o validaciones </w:t>
+      </w:r>
+      <w:proofErr w:type="spellStart"/>
+      <w:r>
+        <w:rPr>
+          <w:rFonts w:ascii="Montserrat" w:eastAsia="Montserrat" w:hAnsi="Montserrat" w:cs="Montserrat"/>
+          <w:sz w:val="22"/>
+          <w:szCs w:val="22"/>
+        </w:rPr>
+        <w:t>authenticated</w:t>
+      </w:r>
+      <w:proofErr w:type="spellEnd"/>
+      <w:r>
+        <w:rPr>
+          <w:rFonts w:ascii="Montserrat" w:eastAsia="Montserrat" w:hAnsi="Montserrat" w:cs="Montserrat"/>
+          <w:sz w:val="22"/>
+          <w:szCs w:val="22"/>
+        </w:rPr>
+        <w:t xml:space="preserve"> que ya lo haga el </w:t>
+      </w:r>
+      <w:proofErr w:type="spellStart"/>
+      <w:r>
+        <w:rPr>
+          <w:rFonts w:ascii="Montserrat" w:eastAsia="Montserrat" w:hAnsi="Montserrat" w:cs="Montserrat"/>
+          <w:sz w:val="22"/>
+          <w:szCs w:val="22"/>
+        </w:rPr>
+        <w:t>framework</w:t>
+      </w:r>
+      <w:proofErr w:type="spellEnd"/>
+      <w:r>
+        <w:rPr>
+          <w:rFonts w:ascii="Montserrat" w:eastAsia="Montserrat" w:hAnsi="Montserrat" w:cs="Montserrat"/>
+          <w:sz w:val="22"/>
+          <w:szCs w:val="22"/>
+        </w:rPr>
+        <w:t xml:space="preserve"> por detrás.</w:t>
       </w:r>
     </w:p>
     <w:p>
@@ -2333,13 +2491,97 @@
         <w:rPr>
           <w:rFonts w:ascii="Montserrat" w:eastAsia="Montserrat" w:hAnsi="Montserrat" w:cs="Montserrat"/>
         </w:rPr>
-        <w:t>Al mergear todo al main puede ser que los csv den conflictos o se hayan cambiado etc… pero en mi rama tomhuecal va todo perfecto.</w:t>
-      </w:r>
-      <w:r>
-        <w:rPr>
-          <w:rFonts w:ascii="Montserrat" w:eastAsia="Montserrat" w:hAnsi="Montserrat" w:cs="Montserrat"/>
-        </w:rPr>
-        <w:t xml:space="preserve"> Se toma la decisión de eliminar los tests de los demás compañeros en la rama personal para agilizar el proceso de testing.</w:t>
+        <w:t xml:space="preserve">Al </w:t>
+      </w:r>
+      <w:proofErr w:type="spellStart"/>
+      <w:r>
+        <w:rPr>
+          <w:rFonts w:ascii="Montserrat" w:eastAsia="Montserrat" w:hAnsi="Montserrat" w:cs="Montserrat"/>
+        </w:rPr>
+        <w:t>mergear</w:t>
+      </w:r>
+      <w:proofErr w:type="spellEnd"/>
+      <w:r>
+        <w:rPr>
+          <w:rFonts w:ascii="Montserrat" w:eastAsia="Montserrat" w:hAnsi="Montserrat" w:cs="Montserrat"/>
+        </w:rPr>
+        <w:t xml:space="preserve"> todo al </w:t>
+      </w:r>
+      <w:proofErr w:type="spellStart"/>
+      <w:r>
+        <w:rPr>
+          <w:rFonts w:ascii="Montserrat" w:eastAsia="Montserrat" w:hAnsi="Montserrat" w:cs="Montserrat"/>
+        </w:rPr>
+        <w:t>main</w:t>
+      </w:r>
+      <w:proofErr w:type="spellEnd"/>
+      <w:r>
+        <w:rPr>
+          <w:rFonts w:ascii="Montserrat" w:eastAsia="Montserrat" w:hAnsi="Montserrat" w:cs="Montserrat"/>
+        </w:rPr>
+        <w:t xml:space="preserve"> puede ser que los </w:t>
+      </w:r>
+      <w:proofErr w:type="spellStart"/>
+      <w:r>
+        <w:rPr>
+          <w:rFonts w:ascii="Montserrat" w:eastAsia="Montserrat" w:hAnsi="Montserrat" w:cs="Montserrat"/>
+        </w:rPr>
+        <w:t>csv</w:t>
+      </w:r>
+      <w:proofErr w:type="spellEnd"/>
+      <w:r>
+        <w:rPr>
+          <w:rFonts w:ascii="Montserrat" w:eastAsia="Montserrat" w:hAnsi="Montserrat" w:cs="Montserrat"/>
+        </w:rPr>
+        <w:t xml:space="preserve"> den conflictos o se hayan cambiado </w:t>
+      </w:r>
+      <w:proofErr w:type="spellStart"/>
+      <w:r>
+        <w:rPr>
+          <w:rFonts w:ascii="Montserrat" w:eastAsia="Montserrat" w:hAnsi="Montserrat" w:cs="Montserrat"/>
+        </w:rPr>
+        <w:t>etc</w:t>
+      </w:r>
+      <w:proofErr w:type="spellEnd"/>
+      <w:r>
+        <w:rPr>
+          <w:rFonts w:ascii="Montserrat" w:eastAsia="Montserrat" w:hAnsi="Montserrat" w:cs="Montserrat"/>
+        </w:rPr>
+        <w:t>… pero en mi rama tomhuecal va todo perfecto.</w:t>
+      </w:r>
+      <w:r>
+        <w:rPr>
+          <w:rFonts w:ascii="Montserrat" w:eastAsia="Montserrat" w:hAnsi="Montserrat" w:cs="Montserrat"/>
+        </w:rPr>
+        <w:t xml:space="preserve"> Se toma la decisión de eliminar los </w:t>
+      </w:r>
+      <w:proofErr w:type="spellStart"/>
+      <w:r>
+        <w:rPr>
+          <w:rFonts w:ascii="Montserrat" w:eastAsia="Montserrat" w:hAnsi="Montserrat" w:cs="Montserrat"/>
+        </w:rPr>
+        <w:t>tests</w:t>
+      </w:r>
+      <w:proofErr w:type="spellEnd"/>
+      <w:r>
+        <w:rPr>
+          <w:rFonts w:ascii="Montserrat" w:eastAsia="Montserrat" w:hAnsi="Montserrat" w:cs="Montserrat"/>
+        </w:rPr>
+        <w:t xml:space="preserve"> de los demás compañeros en la rama personal para agilizar el proceso de </w:t>
+      </w:r>
+      <w:proofErr w:type="spellStart"/>
+      <w:r>
+        <w:rPr>
+          <w:rFonts w:ascii="Montserrat" w:eastAsia="Montserrat" w:hAnsi="Montserrat" w:cs="Montserrat"/>
+        </w:rPr>
+        <w:t>testing</w:t>
+      </w:r>
+      <w:proofErr w:type="spellEnd"/>
+      <w:r>
+        <w:rPr>
+          <w:rFonts w:ascii="Montserrat" w:eastAsia="Montserrat" w:hAnsi="Montserrat" w:cs="Montserrat"/>
+        </w:rPr>
+        <w:t>.</w:t>
       </w:r>
     </w:p>
     <w:p>
@@ -2389,6 +2631,7 @@
           <w:bCs/>
         </w:rPr>
       </w:pPr>
+      <w:proofErr w:type="spellStart"/>
       <w:r>
         <w:rPr>
           <w:rFonts w:ascii="Montserrat" w:eastAsia="Montserrat" w:hAnsi="Montserrat" w:cs="Montserrat"/>
@@ -2397,6 +2640,7 @@
         </w:rPr>
         <w:t>Contract</w:t>
       </w:r>
+      <w:proofErr w:type="spellEnd"/>
     </w:p>
     <w:tbl>
       <w:tblPr>
@@ -2421,12 +2665,14 @@
                 <w:rFonts w:ascii="Montserrat" w:eastAsia="Montserrat" w:hAnsi="Montserrat" w:cs="Montserrat"/>
               </w:rPr>
             </w:pPr>
+            <w:proofErr w:type="spellStart"/>
             <w:r>
               <w:rPr>
                 <w:rFonts w:ascii="Montserrat" w:eastAsia="Montserrat" w:hAnsi="Montserrat" w:cs="Montserrat"/>
               </w:rPr>
               <w:t>Create.safe</w:t>
             </w:r>
+            <w:proofErr w:type="spellEnd"/>
           </w:p>
         </w:tc>
         <w:tc>
@@ -2504,7 +2750,21 @@
               <w:rPr>
                 <w:rFonts w:ascii="Montserrat" w:eastAsia="Montserrat" w:hAnsi="Montserrat" w:cs="Montserrat"/>
               </w:rPr>
-              <w:t>l contrato, el coste de este sea inferior al total cost del proyecto</w:t>
+              <w:t xml:space="preserve">l contrato, el coste de este sea inferior al total </w:t>
+            </w:r>
+            <w:proofErr w:type="spellStart"/>
+            <w:r>
+              <w:rPr>
+                <w:rFonts w:ascii="Montserrat" w:eastAsia="Montserrat" w:hAnsi="Montserrat" w:cs="Montserrat"/>
+              </w:rPr>
+              <w:t>cost</w:t>
+            </w:r>
+            <w:proofErr w:type="spellEnd"/>
+            <w:r>
+              <w:rPr>
+                <w:rFonts w:ascii="Montserrat" w:eastAsia="Montserrat" w:hAnsi="Montserrat" w:cs="Montserrat"/>
+              </w:rPr>
+              <w:t xml:space="preserve"> del proyecto</w:t>
             </w:r>
             <w:r>
               <w:rPr>
@@ -2527,12 +2787,14 @@
                 <w:rFonts w:ascii="Montserrat" w:eastAsia="Montserrat" w:hAnsi="Montserrat" w:cs="Montserrat"/>
               </w:rPr>
             </w:pPr>
+            <w:proofErr w:type="spellStart"/>
             <w:r>
               <w:rPr>
                 <w:rFonts w:ascii="Montserrat" w:eastAsia="Montserrat" w:hAnsi="Montserrat" w:cs="Montserrat"/>
               </w:rPr>
               <w:t>Delete.safe</w:t>
             </w:r>
+            <w:proofErr w:type="spellEnd"/>
           </w:p>
         </w:tc>
         <w:tc>
@@ -2567,6 +2829,7 @@
                 <w:rFonts w:ascii="Montserrat" w:eastAsia="Montserrat" w:hAnsi="Montserrat" w:cs="Montserrat"/>
               </w:rPr>
             </w:pPr>
+            <w:proofErr w:type="spellStart"/>
             <w:r>
               <w:rPr>
                 <w:rFonts w:ascii="Montserrat" w:eastAsia="Montserrat" w:hAnsi="Montserrat" w:cs="Montserrat"/>
@@ -2574,6 +2837,7 @@
               <w:lastRenderedPageBreak/>
               <w:t>List.safe</w:t>
             </w:r>
+            <w:proofErr w:type="spellEnd"/>
           </w:p>
         </w:tc>
         <w:tc>
@@ -2632,12 +2896,14 @@
                 <w:rFonts w:ascii="Montserrat" w:eastAsia="Montserrat" w:hAnsi="Montserrat" w:cs="Montserrat"/>
               </w:rPr>
             </w:pPr>
+            <w:proofErr w:type="spellStart"/>
             <w:r>
               <w:rPr>
                 <w:rFonts w:ascii="Montserrat" w:eastAsia="Montserrat" w:hAnsi="Montserrat" w:cs="Montserrat"/>
               </w:rPr>
               <w:t>Update.safe</w:t>
             </w:r>
+            <w:proofErr w:type="spellEnd"/>
           </w:p>
         </w:tc>
         <w:tc>
@@ -2693,7 +2959,77 @@
               <w:rPr>
                 <w:rFonts w:ascii="Montserrat" w:eastAsia="Montserrat" w:hAnsi="Montserrat" w:cs="Montserrat"/>
               </w:rPr>
-              <w:t xml:space="preserve"> un error, cuando el proyecto seleccionado lo cambias a uno vacio salta exception ya que para que dejar actualizar el contrato se necesita consultar el total cost del proyecto, pero al ser nulo salta NullPointerException. Solución propuesta: Después de hablarlo con el cliente se toma la decisión de que el proyecto no sea modificable en el update.</w:t>
+              <w:t xml:space="preserve"> un error, cuando el proyecto seleccionado lo cambias a uno </w:t>
+            </w:r>
+            <w:proofErr w:type="spellStart"/>
+            <w:r>
+              <w:rPr>
+                <w:rFonts w:ascii="Montserrat" w:eastAsia="Montserrat" w:hAnsi="Montserrat" w:cs="Montserrat"/>
+              </w:rPr>
+              <w:t>vacio</w:t>
+            </w:r>
+            <w:proofErr w:type="spellEnd"/>
+            <w:r>
+              <w:rPr>
+                <w:rFonts w:ascii="Montserrat" w:eastAsia="Montserrat" w:hAnsi="Montserrat" w:cs="Montserrat"/>
+              </w:rPr>
+              <w:t xml:space="preserve"> salta </w:t>
+            </w:r>
+            <w:proofErr w:type="spellStart"/>
+            <w:r>
+              <w:rPr>
+                <w:rFonts w:ascii="Montserrat" w:eastAsia="Montserrat" w:hAnsi="Montserrat" w:cs="Montserrat"/>
+              </w:rPr>
+              <w:t>exception</w:t>
+            </w:r>
+            <w:proofErr w:type="spellEnd"/>
+            <w:r>
+              <w:rPr>
+                <w:rFonts w:ascii="Montserrat" w:eastAsia="Montserrat" w:hAnsi="Montserrat" w:cs="Montserrat"/>
+              </w:rPr>
+              <w:t xml:space="preserve"> ya que para que dejar actualizar el contrato se necesita consultar el total </w:t>
+            </w:r>
+            <w:proofErr w:type="spellStart"/>
+            <w:r>
+              <w:rPr>
+                <w:rFonts w:ascii="Montserrat" w:eastAsia="Montserrat" w:hAnsi="Montserrat" w:cs="Montserrat"/>
+              </w:rPr>
+              <w:t>cost</w:t>
+            </w:r>
+            <w:proofErr w:type="spellEnd"/>
+            <w:r>
+              <w:rPr>
+                <w:rFonts w:ascii="Montserrat" w:eastAsia="Montserrat" w:hAnsi="Montserrat" w:cs="Montserrat"/>
+              </w:rPr>
+              <w:t xml:space="preserve"> del proyecto, pero al ser nulo salta </w:t>
+            </w:r>
+            <w:proofErr w:type="spellStart"/>
+            <w:r>
+              <w:rPr>
+                <w:rFonts w:ascii="Montserrat" w:eastAsia="Montserrat" w:hAnsi="Montserrat" w:cs="Montserrat"/>
+              </w:rPr>
+              <w:t>NullPointerException</w:t>
+            </w:r>
+            <w:proofErr w:type="spellEnd"/>
+            <w:r>
+              <w:rPr>
+                <w:rFonts w:ascii="Montserrat" w:eastAsia="Montserrat" w:hAnsi="Montserrat" w:cs="Montserrat"/>
+              </w:rPr>
+              <w:t xml:space="preserve">. Solución propuesta: Después de hablarlo con el cliente se toma la decisión de que el proyecto no sea modificable en el </w:t>
+            </w:r>
+            <w:proofErr w:type="spellStart"/>
+            <w:r>
+              <w:rPr>
+                <w:rFonts w:ascii="Montserrat" w:eastAsia="Montserrat" w:hAnsi="Montserrat" w:cs="Montserrat"/>
+              </w:rPr>
+              <w:t>update</w:t>
+            </w:r>
+            <w:proofErr w:type="spellEnd"/>
+            <w:r>
+              <w:rPr>
+                <w:rFonts w:ascii="Montserrat" w:eastAsia="Montserrat" w:hAnsi="Montserrat" w:cs="Montserrat"/>
+              </w:rPr>
+              <w:t>.</w:t>
             </w:r>
           </w:p>
         </w:tc>
@@ -2710,12 +3046,14 @@
                 <w:rFonts w:ascii="Montserrat" w:eastAsia="Montserrat" w:hAnsi="Montserrat" w:cs="Montserrat"/>
               </w:rPr>
             </w:pPr>
+            <w:proofErr w:type="spellStart"/>
             <w:r>
               <w:rPr>
                 <w:rFonts w:ascii="Montserrat" w:eastAsia="Montserrat" w:hAnsi="Montserrat" w:cs="Montserrat"/>
               </w:rPr>
               <w:t>Publish.safe</w:t>
             </w:r>
+            <w:proofErr w:type="spellEnd"/>
           </w:p>
         </w:tc>
         <w:tc>
@@ -2769,7 +3107,49 @@
               <w:rPr>
                 <w:rFonts w:ascii="Montserrat" w:eastAsia="Montserrat" w:hAnsi="Montserrat" w:cs="Montserrat"/>
               </w:rPr>
-              <w:t>Se prueba en el publish también ha cambiar datos como un código repetido, dinero negativo para ver si deja hacer publish con los datos cambiados. No se detectan errores, salen avisos si pones código repetidos, dinero negativo etc cuando intentas publicarlo.</w:t>
+              <w:t xml:space="preserve">Se prueba en el </w:t>
+            </w:r>
+            <w:proofErr w:type="spellStart"/>
+            <w:r>
+              <w:rPr>
+                <w:rFonts w:ascii="Montserrat" w:eastAsia="Montserrat" w:hAnsi="Montserrat" w:cs="Montserrat"/>
+              </w:rPr>
+              <w:t>publish</w:t>
+            </w:r>
+            <w:proofErr w:type="spellEnd"/>
+            <w:r>
+              <w:rPr>
+                <w:rFonts w:ascii="Montserrat" w:eastAsia="Montserrat" w:hAnsi="Montserrat" w:cs="Montserrat"/>
+              </w:rPr>
+              <w:t xml:space="preserve"> también ha cambiar datos como un código repetido, dinero negativo para ver si deja hacer </w:t>
+            </w:r>
+            <w:proofErr w:type="spellStart"/>
+            <w:r>
+              <w:rPr>
+                <w:rFonts w:ascii="Montserrat" w:eastAsia="Montserrat" w:hAnsi="Montserrat" w:cs="Montserrat"/>
+              </w:rPr>
+              <w:t>publish</w:t>
+            </w:r>
+            <w:proofErr w:type="spellEnd"/>
+            <w:r>
+              <w:rPr>
+                <w:rFonts w:ascii="Montserrat" w:eastAsia="Montserrat" w:hAnsi="Montserrat" w:cs="Montserrat"/>
+              </w:rPr>
+              <w:t xml:space="preserve"> con los datos cambiados. No se detectan errores, salen avisos si pones código repetidos, dinero negativo </w:t>
+            </w:r>
+            <w:proofErr w:type="spellStart"/>
+            <w:r>
+              <w:rPr>
+                <w:rFonts w:ascii="Montserrat" w:eastAsia="Montserrat" w:hAnsi="Montserrat" w:cs="Montserrat"/>
+              </w:rPr>
+              <w:t>etc</w:t>
+            </w:r>
+            <w:proofErr w:type="spellEnd"/>
+            <w:r>
+              <w:rPr>
+                <w:rFonts w:ascii="Montserrat" w:eastAsia="Montserrat" w:hAnsi="Montserrat" w:cs="Montserrat"/>
+              </w:rPr>
+              <w:t xml:space="preserve"> cuando intentas publicarlo.</w:t>
             </w:r>
           </w:p>
         </w:tc>
@@ -2786,12 +3166,14 @@
                 <w:rFonts w:ascii="Montserrat" w:eastAsia="Montserrat" w:hAnsi="Montserrat" w:cs="Montserrat"/>
               </w:rPr>
             </w:pPr>
+            <w:proofErr w:type="spellStart"/>
             <w:r>
               <w:rPr>
                 <w:rFonts w:ascii="Montserrat" w:eastAsia="Montserrat" w:hAnsi="Montserrat" w:cs="Montserrat"/>
               </w:rPr>
               <w:t>Show.safe</w:t>
             </w:r>
+            <w:proofErr w:type="spellEnd"/>
           </w:p>
         </w:tc>
         <w:tc>
@@ -2862,12 +3244,14 @@
                 <w:rFonts w:ascii="Montserrat" w:eastAsia="Montserrat" w:hAnsi="Montserrat" w:cs="Montserrat"/>
               </w:rPr>
             </w:pPr>
+            <w:proofErr w:type="spellStart"/>
             <w:r>
               <w:rPr>
                 <w:rFonts w:ascii="Montserrat" w:eastAsia="Montserrat" w:hAnsi="Montserrat" w:cs="Montserrat"/>
               </w:rPr>
               <w:t>Create.hack</w:t>
             </w:r>
+            <w:proofErr w:type="spellEnd"/>
           </w:p>
         </w:tc>
         <w:tc>
@@ -2885,7 +3269,35 @@
               <w:rPr>
                 <w:rFonts w:ascii="Montserrat" w:eastAsia="Montserrat" w:hAnsi="Montserrat" w:cs="Montserrat"/>
               </w:rPr>
-              <w:t>Se intenta acceder a la url para crear contrato sin estar logeado, y no deja el acceso.</w:t>
+              <w:t xml:space="preserve">Se intenta acceder a la </w:t>
+            </w:r>
+            <w:proofErr w:type="spellStart"/>
+            <w:r>
+              <w:rPr>
+                <w:rFonts w:ascii="Montserrat" w:eastAsia="Montserrat" w:hAnsi="Montserrat" w:cs="Montserrat"/>
+              </w:rPr>
+              <w:t>url</w:t>
+            </w:r>
+            <w:proofErr w:type="spellEnd"/>
+            <w:r>
+              <w:rPr>
+                <w:rFonts w:ascii="Montserrat" w:eastAsia="Montserrat" w:hAnsi="Montserrat" w:cs="Montserrat"/>
+              </w:rPr>
+              <w:t xml:space="preserve"> para crear contrato sin estar </w:t>
+            </w:r>
+            <w:proofErr w:type="spellStart"/>
+            <w:r>
+              <w:rPr>
+                <w:rFonts w:ascii="Montserrat" w:eastAsia="Montserrat" w:hAnsi="Montserrat" w:cs="Montserrat"/>
+              </w:rPr>
+              <w:t>logeado</w:t>
+            </w:r>
+            <w:proofErr w:type="spellEnd"/>
+            <w:r>
+              <w:rPr>
+                <w:rFonts w:ascii="Montserrat" w:eastAsia="Montserrat" w:hAnsi="Montserrat" w:cs="Montserrat"/>
+              </w:rPr>
+              <w:t>, y no deja el acceso.</w:t>
             </w:r>
           </w:p>
         </w:tc>
@@ -2902,6 +3314,7 @@
                 <w:rFonts w:ascii="Montserrat" w:eastAsia="Montserrat" w:hAnsi="Montserrat" w:cs="Montserrat"/>
               </w:rPr>
             </w:pPr>
+            <w:proofErr w:type="spellStart"/>
             <w:r>
               <w:rPr>
                 <w:rFonts w:ascii="Montserrat" w:eastAsia="Montserrat" w:hAnsi="Montserrat" w:cs="Montserrat"/>
@@ -2909,6 +3322,7 @@
               <w:lastRenderedPageBreak/>
               <w:t>Delete.hack</w:t>
             </w:r>
+            <w:proofErr w:type="spellEnd"/>
           </w:p>
         </w:tc>
         <w:tc>
@@ -2949,12 +3363,14 @@
                 <w:rFonts w:ascii="Montserrat" w:eastAsia="Montserrat" w:hAnsi="Montserrat" w:cs="Montserrat"/>
               </w:rPr>
             </w:pPr>
+            <w:proofErr w:type="spellStart"/>
             <w:r>
               <w:rPr>
                 <w:rFonts w:ascii="Montserrat" w:eastAsia="Montserrat" w:hAnsi="Montserrat" w:cs="Montserrat"/>
               </w:rPr>
               <w:t>List.hack</w:t>
             </w:r>
+            <w:proofErr w:type="spellEnd"/>
           </w:p>
         </w:tc>
         <w:tc>
@@ -3002,12 +3418,14 @@
                 <w:rFonts w:ascii="Montserrat" w:eastAsia="Montserrat" w:hAnsi="Montserrat" w:cs="Montserrat"/>
               </w:rPr>
             </w:pPr>
+            <w:proofErr w:type="spellStart"/>
             <w:r>
               <w:rPr>
                 <w:rFonts w:ascii="Montserrat" w:eastAsia="Montserrat" w:hAnsi="Montserrat" w:cs="Montserrat"/>
               </w:rPr>
               <w:t>Update.hack</w:t>
             </w:r>
+            <w:proofErr w:type="spellEnd"/>
           </w:p>
         </w:tc>
         <w:tc>
@@ -3025,7 +3443,21 @@
               <w:rPr>
                 <w:rFonts w:ascii="Montserrat" w:eastAsia="Montserrat" w:hAnsi="Montserrat" w:cs="Montserrat"/>
               </w:rPr>
-              <w:t>Nos metemos en un contrato del client1 y se cambia la id del formulario para que corresponda a la id de un contrato de otro cliente y se prueba a hacer update y no deja.</w:t>
+              <w:t xml:space="preserve">Nos metemos en un contrato del client1 y se cambia la id del formulario para que corresponda a la id de un contrato de otro cliente y se prueba a hacer </w:t>
+            </w:r>
+            <w:proofErr w:type="spellStart"/>
+            <w:r>
+              <w:rPr>
+                <w:rFonts w:ascii="Montserrat" w:eastAsia="Montserrat" w:hAnsi="Montserrat" w:cs="Montserrat"/>
+              </w:rPr>
+              <w:t>update</w:t>
+            </w:r>
+            <w:proofErr w:type="spellEnd"/>
+            <w:r>
+              <w:rPr>
+                <w:rFonts w:ascii="Montserrat" w:eastAsia="Montserrat" w:hAnsi="Montserrat" w:cs="Montserrat"/>
+              </w:rPr>
+              <w:t xml:space="preserve"> y no deja.</w:t>
             </w:r>
           </w:p>
         </w:tc>
@@ -3042,12 +3474,14 @@
                 <w:rFonts w:ascii="Montserrat" w:eastAsia="Montserrat" w:hAnsi="Montserrat" w:cs="Montserrat"/>
               </w:rPr>
             </w:pPr>
+            <w:proofErr w:type="spellStart"/>
             <w:r>
               <w:rPr>
                 <w:rFonts w:ascii="Montserrat" w:eastAsia="Montserrat" w:hAnsi="Montserrat" w:cs="Montserrat"/>
               </w:rPr>
               <w:t>Publish.hack</w:t>
             </w:r>
+            <w:proofErr w:type="spellEnd"/>
           </w:p>
         </w:tc>
         <w:tc>
@@ -3065,7 +3499,21 @@
               <w:rPr>
                 <w:rFonts w:ascii="Montserrat" w:eastAsia="Montserrat" w:hAnsi="Montserrat" w:cs="Montserrat"/>
               </w:rPr>
-              <w:t xml:space="preserve">Se prueba a publicar un contrato sin rol, con rol distinto, y con el el rol pertinente del </w:t>
+              <w:t xml:space="preserve">Se prueba a publicar un contrato sin rol, con rol distinto, y con el </w:t>
+            </w:r>
+            <w:proofErr w:type="spellStart"/>
+            <w:r>
+              <w:rPr>
+                <w:rFonts w:ascii="Montserrat" w:eastAsia="Montserrat" w:hAnsi="Montserrat" w:cs="Montserrat"/>
+              </w:rPr>
+              <w:t>el</w:t>
+            </w:r>
+            <w:proofErr w:type="spellEnd"/>
+            <w:r>
+              <w:rPr>
+                <w:rFonts w:ascii="Montserrat" w:eastAsia="Montserrat" w:hAnsi="Montserrat" w:cs="Montserrat"/>
+              </w:rPr>
+              <w:t xml:space="preserve"> rol pertinente del </w:t>
             </w:r>
             <w:r>
               <w:rPr>
@@ -3088,12 +3536,14 @@
                 <w:rFonts w:ascii="Montserrat" w:eastAsia="Montserrat" w:hAnsi="Montserrat" w:cs="Montserrat"/>
               </w:rPr>
             </w:pPr>
+            <w:proofErr w:type="spellStart"/>
             <w:r>
               <w:rPr>
                 <w:rFonts w:ascii="Montserrat" w:eastAsia="Montserrat" w:hAnsi="Montserrat" w:cs="Montserrat"/>
               </w:rPr>
               <w:t>Show.hack</w:t>
             </w:r>
+            <w:proofErr w:type="spellEnd"/>
           </w:p>
         </w:tc>
         <w:tc>
@@ -3129,7 +3579,21 @@
               <w:rPr>
                 <w:rFonts w:ascii="Montserrat" w:eastAsia="Montserrat" w:hAnsi="Montserrat" w:cs="Montserrat"/>
               </w:rPr>
-              <w:t xml:space="preserve">un rol distinto al cliente o que el contrato no pertenezca al cliente logeado </w:t>
+              <w:t xml:space="preserve">un rol distinto al cliente o que el contrato no pertenezca al cliente </w:t>
+            </w:r>
+            <w:proofErr w:type="spellStart"/>
+            <w:r>
+              <w:rPr>
+                <w:rFonts w:ascii="Montserrat" w:eastAsia="Montserrat" w:hAnsi="Montserrat" w:cs="Montserrat"/>
+              </w:rPr>
+              <w:t>logeado</w:t>
+            </w:r>
+            <w:proofErr w:type="spellEnd"/>
+            <w:r>
+              <w:rPr>
+                <w:rFonts w:ascii="Montserrat" w:eastAsia="Montserrat" w:hAnsi="Montserrat" w:cs="Montserrat"/>
+              </w:rPr>
+              <w:t xml:space="preserve"> </w:t>
             </w:r>
             <w:r>
               <w:rPr>
@@ -3188,6 +3652,7 @@
           <w:bCs/>
         </w:rPr>
       </w:pPr>
+      <w:proofErr w:type="spellStart"/>
       <w:r>
         <w:rPr>
           <w:rFonts w:ascii="Montserrat" w:eastAsia="Montserrat" w:hAnsi="Montserrat" w:cs="Montserrat"/>
@@ -3195,7 +3660,16 @@
           <w:bCs/>
         </w:rPr>
         <w:lastRenderedPageBreak/>
-        <w:t>Progress log</w:t>
+        <w:t>Progress</w:t>
+      </w:r>
+      <w:proofErr w:type="spellEnd"/>
+      <w:r>
+        <w:rPr>
+          <w:rFonts w:ascii="Montserrat" w:eastAsia="Montserrat" w:hAnsi="Montserrat" w:cs="Montserrat"/>
+          <w:b/>
+          <w:bCs/>
+        </w:rPr>
+        <w:t xml:space="preserve"> log</w:t>
       </w:r>
     </w:p>
     <w:tbl>
@@ -3221,12 +3695,14 @@
                 <w:rFonts w:ascii="Montserrat" w:eastAsia="Montserrat" w:hAnsi="Montserrat" w:cs="Montserrat"/>
               </w:rPr>
             </w:pPr>
+            <w:proofErr w:type="spellStart"/>
             <w:r>
               <w:rPr>
                 <w:rFonts w:ascii="Montserrat" w:eastAsia="Montserrat" w:hAnsi="Montserrat" w:cs="Montserrat"/>
               </w:rPr>
               <w:t>Create.safe</w:t>
             </w:r>
+            <w:proofErr w:type="spellEnd"/>
           </w:p>
         </w:tc>
         <w:tc>
@@ -3262,7 +3738,21 @@
               <w:rPr>
                 <w:rFonts w:ascii="Montserrat" w:eastAsia="Montserrat" w:hAnsi="Montserrat" w:cs="Montserrat"/>
               </w:rPr>
-              <w:t>un progress log asociado a un contrato</w:t>
+              <w:t xml:space="preserve">un </w:t>
+            </w:r>
+            <w:proofErr w:type="spellStart"/>
+            <w:r>
+              <w:rPr>
+                <w:rFonts w:ascii="Montserrat" w:eastAsia="Montserrat" w:hAnsi="Montserrat" w:cs="Montserrat"/>
+              </w:rPr>
+              <w:t>progress</w:t>
+            </w:r>
+            <w:proofErr w:type="spellEnd"/>
+            <w:r>
+              <w:rPr>
+                <w:rFonts w:ascii="Montserrat" w:eastAsia="Montserrat" w:hAnsi="Montserrat" w:cs="Montserrat"/>
+              </w:rPr>
+              <w:t xml:space="preserve"> log asociado a un contrato</w:t>
             </w:r>
             <w:r>
               <w:rPr>
@@ -3285,12 +3775,14 @@
                 <w:rFonts w:ascii="Montserrat" w:eastAsia="Montserrat" w:hAnsi="Montserrat" w:cs="Montserrat"/>
               </w:rPr>
             </w:pPr>
+            <w:proofErr w:type="spellStart"/>
             <w:r>
               <w:rPr>
                 <w:rFonts w:ascii="Montserrat" w:eastAsia="Montserrat" w:hAnsi="Montserrat" w:cs="Montserrat"/>
               </w:rPr>
               <w:t>Delete.safe</w:t>
             </w:r>
+            <w:proofErr w:type="spellEnd"/>
           </w:p>
         </w:tc>
         <w:tc>
@@ -3308,7 +3800,35 @@
               <w:rPr>
                 <w:rFonts w:ascii="Montserrat" w:eastAsia="Montserrat" w:hAnsi="Montserrat" w:cs="Montserrat"/>
               </w:rPr>
-              <w:t>Se intenta eliminar un progress log y no hay problema. Se recuerda que los progress log así como los contratos solo pueden ser eliminado</w:t>
+              <w:t xml:space="preserve">Se intenta eliminar un </w:t>
+            </w:r>
+            <w:proofErr w:type="spellStart"/>
+            <w:r>
+              <w:rPr>
+                <w:rFonts w:ascii="Montserrat" w:eastAsia="Montserrat" w:hAnsi="Montserrat" w:cs="Montserrat"/>
+              </w:rPr>
+              <w:t>progress</w:t>
+            </w:r>
+            <w:proofErr w:type="spellEnd"/>
+            <w:r>
+              <w:rPr>
+                <w:rFonts w:ascii="Montserrat" w:eastAsia="Montserrat" w:hAnsi="Montserrat" w:cs="Montserrat"/>
+              </w:rPr>
+              <w:t xml:space="preserve"> log y no hay problema. Se recuerda que los </w:t>
+            </w:r>
+            <w:proofErr w:type="spellStart"/>
+            <w:r>
+              <w:rPr>
+                <w:rFonts w:ascii="Montserrat" w:eastAsia="Montserrat" w:hAnsi="Montserrat" w:cs="Montserrat"/>
+              </w:rPr>
+              <w:t>progress</w:t>
+            </w:r>
+            <w:proofErr w:type="spellEnd"/>
+            <w:r>
+              <w:rPr>
+                <w:rFonts w:ascii="Montserrat" w:eastAsia="Montserrat" w:hAnsi="Montserrat" w:cs="Montserrat"/>
+              </w:rPr>
+              <w:t xml:space="preserve"> log así como los contratos solo pueden ser eliminado</w:t>
             </w:r>
             <w:r>
               <w:rPr>
@@ -3326,8 +3846,16 @@
               <w:rPr>
                 <w:rFonts w:ascii="Montserrat" w:eastAsia="Montserrat" w:hAnsi="Montserrat" w:cs="Montserrat"/>
               </w:rPr>
-              <w:t>hacerlos updates</w:t>
-            </w:r>
+              <w:t xml:space="preserve">hacerlos </w:t>
+            </w:r>
+            <w:proofErr w:type="spellStart"/>
+            <w:r>
+              <w:rPr>
+                <w:rFonts w:ascii="Montserrat" w:eastAsia="Montserrat" w:hAnsi="Montserrat" w:cs="Montserrat"/>
+              </w:rPr>
+              <w:t>updates</w:t>
+            </w:r>
+            <w:proofErr w:type="spellEnd"/>
             <w:r>
               <w:rPr>
                 <w:rFonts w:ascii="Montserrat" w:eastAsia="Montserrat" w:hAnsi="Montserrat" w:cs="Montserrat"/>
@@ -3349,12 +3877,14 @@
                 <w:rFonts w:ascii="Montserrat" w:eastAsia="Montserrat" w:hAnsi="Montserrat" w:cs="Montserrat"/>
               </w:rPr>
             </w:pPr>
+            <w:proofErr w:type="spellStart"/>
             <w:r>
               <w:rPr>
                 <w:rFonts w:ascii="Montserrat" w:eastAsia="Montserrat" w:hAnsi="Montserrat" w:cs="Montserrat"/>
               </w:rPr>
               <w:t>List.safe</w:t>
             </w:r>
+            <w:proofErr w:type="spellEnd"/>
           </w:p>
         </w:tc>
         <w:tc>
@@ -3390,7 +3920,21 @@
               <w:rPr>
                 <w:rFonts w:ascii="Montserrat" w:eastAsia="Montserrat" w:hAnsi="Montserrat" w:cs="Montserrat"/>
               </w:rPr>
-              <w:t>todos los progress log</w:t>
+              <w:t xml:space="preserve">todos los </w:t>
+            </w:r>
+            <w:proofErr w:type="spellStart"/>
+            <w:r>
+              <w:rPr>
+                <w:rFonts w:ascii="Montserrat" w:eastAsia="Montserrat" w:hAnsi="Montserrat" w:cs="Montserrat"/>
+              </w:rPr>
+              <w:t>progress</w:t>
+            </w:r>
+            <w:proofErr w:type="spellEnd"/>
+            <w:r>
+              <w:rPr>
+                <w:rFonts w:ascii="Montserrat" w:eastAsia="Montserrat" w:hAnsi="Montserrat" w:cs="Montserrat"/>
+              </w:rPr>
+              <w:t xml:space="preserve"> log</w:t>
             </w:r>
             <w:r>
               <w:rPr>
@@ -3425,15 +3969,24 @@
                 <w:rFonts w:ascii="Montserrat" w:eastAsia="Montserrat" w:hAnsi="Montserrat" w:cs="Montserrat"/>
                 <w:lang w:val="en-US"/>
               </w:rPr>
-              <w:t>list-by-contract</w:t>
-            </w:r>
+              <w:t>list-by-</w:t>
+            </w:r>
+            <w:proofErr w:type="spellStart"/>
             <w:r>
               <w:rPr>
                 <w:rFonts w:ascii="Montserrat" w:eastAsia="Montserrat" w:hAnsi="Montserrat" w:cs="Montserrat"/>
                 <w:lang w:val="en-US"/>
               </w:rPr>
+              <w:t>contract</w:t>
+            </w:r>
+            <w:r>
+              <w:rPr>
+                <w:rFonts w:ascii="Montserrat" w:eastAsia="Montserrat" w:hAnsi="Montserrat" w:cs="Montserrat"/>
+                <w:lang w:val="en-US"/>
+              </w:rPr>
               <w:t>.safe</w:t>
             </w:r>
+            <w:proofErr w:type="spellEnd"/>
           </w:p>
         </w:tc>
         <w:tc>
@@ -3457,13 +4010,63 @@
               <w:rPr>
                 <w:rFonts w:ascii="Montserrat" w:eastAsia="Montserrat" w:hAnsi="Montserrat" w:cs="Montserrat"/>
               </w:rPr>
-              <w:t xml:space="preserve">client1 y hace show de un contrato que tenga progress log asociados. Al darle a la opción de list </w:t>
-            </w:r>
-            <w:r>
-              <w:rPr>
-                <w:rFonts w:ascii="Montserrat" w:eastAsia="Montserrat" w:hAnsi="Montserrat" w:cs="Montserrat"/>
-              </w:rPr>
-              <w:t>progress log se muestras todos los progress log asociados a ese contrato. No se detecta fallo</w:t>
+              <w:t xml:space="preserve">client1 y hace show de un contrato que tenga </w:t>
+            </w:r>
+            <w:proofErr w:type="spellStart"/>
+            <w:r>
+              <w:rPr>
+                <w:rFonts w:ascii="Montserrat" w:eastAsia="Montserrat" w:hAnsi="Montserrat" w:cs="Montserrat"/>
+              </w:rPr>
+              <w:t>progress</w:t>
+            </w:r>
+            <w:proofErr w:type="spellEnd"/>
+            <w:r>
+              <w:rPr>
+                <w:rFonts w:ascii="Montserrat" w:eastAsia="Montserrat" w:hAnsi="Montserrat" w:cs="Montserrat"/>
+              </w:rPr>
+              <w:t xml:space="preserve"> log asociados. Al darle a la opción de </w:t>
+            </w:r>
+            <w:proofErr w:type="spellStart"/>
+            <w:r>
+              <w:rPr>
+                <w:rFonts w:ascii="Montserrat" w:eastAsia="Montserrat" w:hAnsi="Montserrat" w:cs="Montserrat"/>
+              </w:rPr>
+              <w:t>list</w:t>
+            </w:r>
+            <w:proofErr w:type="spellEnd"/>
+            <w:r>
+              <w:rPr>
+                <w:rFonts w:ascii="Montserrat" w:eastAsia="Montserrat" w:hAnsi="Montserrat" w:cs="Montserrat"/>
+              </w:rPr>
+              <w:t xml:space="preserve"> </w:t>
+            </w:r>
+            <w:proofErr w:type="spellStart"/>
+            <w:r>
+              <w:rPr>
+                <w:rFonts w:ascii="Montserrat" w:eastAsia="Montserrat" w:hAnsi="Montserrat" w:cs="Montserrat"/>
+              </w:rPr>
+              <w:t>progress</w:t>
+            </w:r>
+            <w:proofErr w:type="spellEnd"/>
+            <w:r>
+              <w:rPr>
+                <w:rFonts w:ascii="Montserrat" w:eastAsia="Montserrat" w:hAnsi="Montserrat" w:cs="Montserrat"/>
+              </w:rPr>
+              <w:t xml:space="preserve"> log se muestras todos los </w:t>
+            </w:r>
+            <w:proofErr w:type="spellStart"/>
+            <w:r>
+              <w:rPr>
+                <w:rFonts w:ascii="Montserrat" w:eastAsia="Montserrat" w:hAnsi="Montserrat" w:cs="Montserrat"/>
+              </w:rPr>
+              <w:t>progress</w:t>
+            </w:r>
+            <w:proofErr w:type="spellEnd"/>
+            <w:r>
+              <w:rPr>
+                <w:rFonts w:ascii="Montserrat" w:eastAsia="Montserrat" w:hAnsi="Montserrat" w:cs="Montserrat"/>
+              </w:rPr>
+              <w:t xml:space="preserve"> log asociados a ese contrato. No se detecta fallo</w:t>
             </w:r>
           </w:p>
         </w:tc>
@@ -3480,12 +4083,14 @@
                 <w:rFonts w:ascii="Montserrat" w:eastAsia="Montserrat" w:hAnsi="Montserrat" w:cs="Montserrat"/>
               </w:rPr>
             </w:pPr>
+            <w:proofErr w:type="spellStart"/>
             <w:r>
               <w:rPr>
                 <w:rFonts w:ascii="Montserrat" w:eastAsia="Montserrat" w:hAnsi="Montserrat" w:cs="Montserrat"/>
               </w:rPr>
               <w:t>Publish.safe</w:t>
             </w:r>
+            <w:proofErr w:type="spellEnd"/>
           </w:p>
         </w:tc>
         <w:tc>
@@ -3503,7 +4108,21 @@
               <w:rPr>
                 <w:rFonts w:ascii="Montserrat" w:eastAsia="Montserrat" w:hAnsi="Montserrat" w:cs="Montserrat"/>
               </w:rPr>
-              <w:t>Se inicia sesión como un client1 y se publica un progress log.</w:t>
+              <w:t xml:space="preserve">Se inicia sesión como un client1 y se publica un </w:t>
+            </w:r>
+            <w:proofErr w:type="spellStart"/>
+            <w:r>
+              <w:rPr>
+                <w:rFonts w:ascii="Montserrat" w:eastAsia="Montserrat" w:hAnsi="Montserrat" w:cs="Montserrat"/>
+              </w:rPr>
+              <w:t>progress</w:t>
+            </w:r>
+            <w:proofErr w:type="spellEnd"/>
+            <w:r>
+              <w:rPr>
+                <w:rFonts w:ascii="Montserrat" w:eastAsia="Montserrat" w:hAnsi="Montserrat" w:cs="Montserrat"/>
+              </w:rPr>
+              <w:t xml:space="preserve"> log.</w:t>
             </w:r>
           </w:p>
         </w:tc>
@@ -3520,12 +4139,14 @@
                 <w:rFonts w:ascii="Montserrat" w:eastAsia="Montserrat" w:hAnsi="Montserrat" w:cs="Montserrat"/>
               </w:rPr>
             </w:pPr>
+            <w:proofErr w:type="spellStart"/>
             <w:r>
               <w:rPr>
                 <w:rFonts w:ascii="Montserrat" w:eastAsia="Montserrat" w:hAnsi="Montserrat" w:cs="Montserrat"/>
               </w:rPr>
               <w:t>Show.safe</w:t>
             </w:r>
+            <w:proofErr w:type="spellEnd"/>
           </w:p>
         </w:tc>
         <w:tc>
@@ -3549,7 +4170,49 @@
               <w:rPr>
                 <w:rFonts w:ascii="Montserrat" w:eastAsia="Montserrat" w:hAnsi="Montserrat" w:cs="Montserrat"/>
               </w:rPr>
-              <w:t>client1 y se listas los progress log. Al clickear uno hace un show con la id de ese progress log no se detectan fallos.</w:t>
+              <w:t xml:space="preserve">client1 y se listas los </w:t>
+            </w:r>
+            <w:proofErr w:type="spellStart"/>
+            <w:r>
+              <w:rPr>
+                <w:rFonts w:ascii="Montserrat" w:eastAsia="Montserrat" w:hAnsi="Montserrat" w:cs="Montserrat"/>
+              </w:rPr>
+              <w:t>progress</w:t>
+            </w:r>
+            <w:proofErr w:type="spellEnd"/>
+            <w:r>
+              <w:rPr>
+                <w:rFonts w:ascii="Montserrat" w:eastAsia="Montserrat" w:hAnsi="Montserrat" w:cs="Montserrat"/>
+              </w:rPr>
+              <w:t xml:space="preserve"> log. Al </w:t>
+            </w:r>
+            <w:proofErr w:type="spellStart"/>
+            <w:r>
+              <w:rPr>
+                <w:rFonts w:ascii="Montserrat" w:eastAsia="Montserrat" w:hAnsi="Montserrat" w:cs="Montserrat"/>
+              </w:rPr>
+              <w:t>clickear</w:t>
+            </w:r>
+            <w:proofErr w:type="spellEnd"/>
+            <w:r>
+              <w:rPr>
+                <w:rFonts w:ascii="Montserrat" w:eastAsia="Montserrat" w:hAnsi="Montserrat" w:cs="Montserrat"/>
+              </w:rPr>
+              <w:t xml:space="preserve"> uno hace un show con la id de ese </w:t>
+            </w:r>
+            <w:proofErr w:type="spellStart"/>
+            <w:r>
+              <w:rPr>
+                <w:rFonts w:ascii="Montserrat" w:eastAsia="Montserrat" w:hAnsi="Montserrat" w:cs="Montserrat"/>
+              </w:rPr>
+              <w:t>progress</w:t>
+            </w:r>
+            <w:proofErr w:type="spellEnd"/>
+            <w:r>
+              <w:rPr>
+                <w:rFonts w:ascii="Montserrat" w:eastAsia="Montserrat" w:hAnsi="Montserrat" w:cs="Montserrat"/>
+              </w:rPr>
+              <w:t xml:space="preserve"> log no se detectan fallos.</w:t>
             </w:r>
           </w:p>
         </w:tc>
@@ -3566,6 +4229,7 @@
                 <w:rFonts w:ascii="Montserrat" w:eastAsia="Montserrat" w:hAnsi="Montserrat" w:cs="Montserrat"/>
               </w:rPr>
             </w:pPr>
+            <w:proofErr w:type="spellStart"/>
             <w:r>
               <w:rPr>
                 <w:rFonts w:ascii="Montserrat" w:eastAsia="Montserrat" w:hAnsi="Montserrat" w:cs="Montserrat"/>
@@ -3573,6 +4237,7 @@
               <w:lastRenderedPageBreak/>
               <w:t>Update.safe</w:t>
             </w:r>
+            <w:proofErr w:type="spellEnd"/>
           </w:p>
         </w:tc>
         <w:tc>
@@ -3596,7 +4261,21 @@
               <w:rPr>
                 <w:rFonts w:ascii="Montserrat" w:eastAsia="Montserrat" w:hAnsi="Montserrat" w:cs="Montserrat"/>
               </w:rPr>
-              <w:t xml:space="preserve">client1 y se prueba a actualizar un progress log de todas las formas posibles (campos vacíos, </w:t>
+              <w:t xml:space="preserve">client1 y se prueba a actualizar un </w:t>
+            </w:r>
+            <w:proofErr w:type="spellStart"/>
+            <w:r>
+              <w:rPr>
+                <w:rFonts w:ascii="Montserrat" w:eastAsia="Montserrat" w:hAnsi="Montserrat" w:cs="Montserrat"/>
+              </w:rPr>
+              <w:t>progress</w:t>
+            </w:r>
+            <w:proofErr w:type="spellEnd"/>
+            <w:r>
+              <w:rPr>
+                <w:rFonts w:ascii="Montserrat" w:eastAsia="Montserrat" w:hAnsi="Montserrat" w:cs="Montserrat"/>
+              </w:rPr>
+              <w:t xml:space="preserve"> log de todas las formas posibles (campos vacíos, </w:t>
             </w:r>
             <w:r>
               <w:rPr>
@@ -3608,7 +4287,21 @@
               <w:rPr>
                 <w:rFonts w:ascii="Montserrat" w:eastAsia="Montserrat" w:hAnsi="Montserrat" w:cs="Montserrat"/>
               </w:rPr>
-              <w:t xml:space="preserve"> de caracteres etc)</w:t>
+              <w:t xml:space="preserve"> de caracteres </w:t>
+            </w:r>
+            <w:proofErr w:type="spellStart"/>
+            <w:r>
+              <w:rPr>
+                <w:rFonts w:ascii="Montserrat" w:eastAsia="Montserrat" w:hAnsi="Montserrat" w:cs="Montserrat"/>
+              </w:rPr>
+              <w:t>etc</w:t>
+            </w:r>
+            <w:proofErr w:type="spellEnd"/>
+            <w:r>
+              <w:rPr>
+                <w:rFonts w:ascii="Montserrat" w:eastAsia="Montserrat" w:hAnsi="Montserrat" w:cs="Montserrat"/>
+              </w:rPr>
+              <w:t>)</w:t>
             </w:r>
           </w:p>
         </w:tc>
@@ -3625,12 +4318,14 @@
                 <w:rFonts w:ascii="Montserrat" w:eastAsia="Montserrat" w:hAnsi="Montserrat" w:cs="Montserrat"/>
               </w:rPr>
             </w:pPr>
+            <w:proofErr w:type="spellStart"/>
             <w:r>
               <w:rPr>
                 <w:rFonts w:ascii="Montserrat" w:eastAsia="Montserrat" w:hAnsi="Montserrat" w:cs="Montserrat"/>
               </w:rPr>
               <w:t>Create.hack</w:t>
             </w:r>
+            <w:proofErr w:type="spellEnd"/>
           </w:p>
         </w:tc>
         <w:tc>
@@ -3656,25 +4351,113 @@
                 <w:b/>
                 <w:bCs/>
               </w:rPr>
-              <w:t>publicar un progress log en un contrato ya publicado</w:t>
-            </w:r>
-            <w:r>
-              <w:rPr>
-                <w:rFonts w:ascii="Montserrat" w:eastAsia="Montserrat" w:hAnsi="Montserrat" w:cs="Montserrat"/>
-              </w:rPr>
-              <w:t xml:space="preserve"> accediendo directamente a la url para crear un progress log con</w:t>
-            </w:r>
-            <w:r>
-              <w:rPr>
-                <w:rFonts w:ascii="Montserrat" w:eastAsia="Montserrat" w:hAnsi="Montserrat" w:cs="Montserrat"/>
-              </w:rPr>
-              <w:t xml:space="preserve"> el contract id del contracto publicado</w:t>
-            </w:r>
-            <w:r>
-              <w:rPr>
-                <w:rFonts w:ascii="Montserrat" w:eastAsia="Montserrat" w:hAnsi="Montserrat" w:cs="Montserrat"/>
-              </w:rPr>
-              <w:t xml:space="preserve">. También se prueba para ver si se puede publicar un progress log en un contrato que no pertenece al cliente logeado. Se prueba con </w:t>
+              <w:t xml:space="preserve">publicar un </w:t>
+            </w:r>
+            <w:proofErr w:type="spellStart"/>
+            <w:r>
+              <w:rPr>
+                <w:rFonts w:ascii="Montserrat" w:eastAsia="Montserrat" w:hAnsi="Montserrat" w:cs="Montserrat"/>
+                <w:b/>
+                <w:bCs/>
+              </w:rPr>
+              <w:t>progress</w:t>
+            </w:r>
+            <w:proofErr w:type="spellEnd"/>
+            <w:r>
+              <w:rPr>
+                <w:rFonts w:ascii="Montserrat" w:eastAsia="Montserrat" w:hAnsi="Montserrat" w:cs="Montserrat"/>
+                <w:b/>
+                <w:bCs/>
+              </w:rPr>
+              <w:t xml:space="preserve"> log en un contrato ya publicado</w:t>
+            </w:r>
+            <w:r>
+              <w:rPr>
+                <w:rFonts w:ascii="Montserrat" w:eastAsia="Montserrat" w:hAnsi="Montserrat" w:cs="Montserrat"/>
+              </w:rPr>
+              <w:t xml:space="preserve"> accediendo directamente a la </w:t>
+            </w:r>
+            <w:proofErr w:type="spellStart"/>
+            <w:r>
+              <w:rPr>
+                <w:rFonts w:ascii="Montserrat" w:eastAsia="Montserrat" w:hAnsi="Montserrat" w:cs="Montserrat"/>
+              </w:rPr>
+              <w:t>url</w:t>
+            </w:r>
+            <w:proofErr w:type="spellEnd"/>
+            <w:r>
+              <w:rPr>
+                <w:rFonts w:ascii="Montserrat" w:eastAsia="Montserrat" w:hAnsi="Montserrat" w:cs="Montserrat"/>
+              </w:rPr>
+              <w:t xml:space="preserve"> para crear un </w:t>
+            </w:r>
+            <w:proofErr w:type="spellStart"/>
+            <w:r>
+              <w:rPr>
+                <w:rFonts w:ascii="Montserrat" w:eastAsia="Montserrat" w:hAnsi="Montserrat" w:cs="Montserrat"/>
+              </w:rPr>
+              <w:t>progress</w:t>
+            </w:r>
+            <w:proofErr w:type="spellEnd"/>
+            <w:r>
+              <w:rPr>
+                <w:rFonts w:ascii="Montserrat" w:eastAsia="Montserrat" w:hAnsi="Montserrat" w:cs="Montserrat"/>
+              </w:rPr>
+              <w:t xml:space="preserve"> log con</w:t>
+            </w:r>
+            <w:r>
+              <w:rPr>
+                <w:rFonts w:ascii="Montserrat" w:eastAsia="Montserrat" w:hAnsi="Montserrat" w:cs="Montserrat"/>
+              </w:rPr>
+              <w:t xml:space="preserve"> el </w:t>
+            </w:r>
+            <w:proofErr w:type="spellStart"/>
+            <w:r>
+              <w:rPr>
+                <w:rFonts w:ascii="Montserrat" w:eastAsia="Montserrat" w:hAnsi="Montserrat" w:cs="Montserrat"/>
+              </w:rPr>
+              <w:t>contract</w:t>
+            </w:r>
+            <w:proofErr w:type="spellEnd"/>
+            <w:r>
+              <w:rPr>
+                <w:rFonts w:ascii="Montserrat" w:eastAsia="Montserrat" w:hAnsi="Montserrat" w:cs="Montserrat"/>
+              </w:rPr>
+              <w:t xml:space="preserve"> id del contracto publicado</w:t>
+            </w:r>
+            <w:r>
+              <w:rPr>
+                <w:rFonts w:ascii="Montserrat" w:eastAsia="Montserrat" w:hAnsi="Montserrat" w:cs="Montserrat"/>
+              </w:rPr>
+              <w:t xml:space="preserve">. También se prueba para ver si se puede publicar un </w:t>
+            </w:r>
+            <w:proofErr w:type="spellStart"/>
+            <w:r>
+              <w:rPr>
+                <w:rFonts w:ascii="Montserrat" w:eastAsia="Montserrat" w:hAnsi="Montserrat" w:cs="Montserrat"/>
+              </w:rPr>
+              <w:t>progress</w:t>
+            </w:r>
+            <w:proofErr w:type="spellEnd"/>
+            <w:r>
+              <w:rPr>
+                <w:rFonts w:ascii="Montserrat" w:eastAsia="Montserrat" w:hAnsi="Montserrat" w:cs="Montserrat"/>
+              </w:rPr>
+              <w:t xml:space="preserve"> log en un contrato que no pertenece al cliente </w:t>
+            </w:r>
+            <w:proofErr w:type="spellStart"/>
+            <w:r>
+              <w:rPr>
+                <w:rFonts w:ascii="Montserrat" w:eastAsia="Montserrat" w:hAnsi="Montserrat" w:cs="Montserrat"/>
+              </w:rPr>
+              <w:t>logeado</w:t>
+            </w:r>
+            <w:proofErr w:type="spellEnd"/>
+            <w:r>
+              <w:rPr>
+                <w:rFonts w:ascii="Montserrat" w:eastAsia="Montserrat" w:hAnsi="Montserrat" w:cs="Montserrat"/>
+              </w:rPr>
+              <w:t xml:space="preserve">. Se prueba con </w:t>
             </w:r>
             <w:r>
               <w:rPr>
@@ -3686,7 +4469,35 @@
               <w:rPr>
                 <w:rFonts w:ascii="Montserrat" w:eastAsia="Montserrat" w:hAnsi="Montserrat" w:cs="Montserrat"/>
               </w:rPr>
-              <w:t>pertenece al client 1 y estando logeado con client2. No deja en ambos casos</w:t>
+              <w:t xml:space="preserve">pertenece al </w:t>
+            </w:r>
+            <w:proofErr w:type="spellStart"/>
+            <w:r>
+              <w:rPr>
+                <w:rFonts w:ascii="Montserrat" w:eastAsia="Montserrat" w:hAnsi="Montserrat" w:cs="Montserrat"/>
+              </w:rPr>
+              <w:t>client</w:t>
+            </w:r>
+            <w:proofErr w:type="spellEnd"/>
+            <w:r>
+              <w:rPr>
+                <w:rFonts w:ascii="Montserrat" w:eastAsia="Montserrat" w:hAnsi="Montserrat" w:cs="Montserrat"/>
+              </w:rPr>
+              <w:t xml:space="preserve"> 1 y estando </w:t>
+            </w:r>
+            <w:proofErr w:type="spellStart"/>
+            <w:r>
+              <w:rPr>
+                <w:rFonts w:ascii="Montserrat" w:eastAsia="Montserrat" w:hAnsi="Montserrat" w:cs="Montserrat"/>
+              </w:rPr>
+              <w:t>logeado</w:t>
+            </w:r>
+            <w:proofErr w:type="spellEnd"/>
+            <w:r>
+              <w:rPr>
+                <w:rFonts w:ascii="Montserrat" w:eastAsia="Montserrat" w:hAnsi="Montserrat" w:cs="Montserrat"/>
+              </w:rPr>
+              <w:t xml:space="preserve"> con client2. No deja en ambos casos</w:t>
             </w:r>
           </w:p>
         </w:tc>
@@ -3703,12 +4514,14 @@
                 <w:rFonts w:ascii="Montserrat" w:eastAsia="Montserrat" w:hAnsi="Montserrat" w:cs="Montserrat"/>
               </w:rPr>
             </w:pPr>
+            <w:proofErr w:type="spellStart"/>
             <w:r>
               <w:rPr>
                 <w:rFonts w:ascii="Montserrat" w:eastAsia="Montserrat" w:hAnsi="Montserrat" w:cs="Montserrat"/>
               </w:rPr>
               <w:t>List.hack</w:t>
             </w:r>
+            <w:proofErr w:type="spellEnd"/>
           </w:p>
         </w:tc>
         <w:tc>
@@ -3728,11 +4541,61 @@
               </w:rPr>
               <w:t>Se hace /</w:t>
             </w:r>
-            <w:r>
-              <w:rPr>
-                <w:rFonts w:ascii="Montserrat" w:eastAsia="Montserrat" w:hAnsi="Montserrat" w:cs="Montserrat"/>
-              </w:rPr>
-              <w:t>progress/list cuando no esta logeado, o con otro rol distinto y no muestra la lista de los progresos.</w:t>
+            <w:proofErr w:type="spellStart"/>
+            <w:r>
+              <w:rPr>
+                <w:rFonts w:ascii="Montserrat" w:eastAsia="Montserrat" w:hAnsi="Montserrat" w:cs="Montserrat"/>
+              </w:rPr>
+              <w:t>progress</w:t>
+            </w:r>
+            <w:proofErr w:type="spellEnd"/>
+            <w:r>
+              <w:rPr>
+                <w:rFonts w:ascii="Montserrat" w:eastAsia="Montserrat" w:hAnsi="Montserrat" w:cs="Montserrat"/>
+              </w:rPr>
+              <w:t>/</w:t>
+            </w:r>
+            <w:proofErr w:type="spellStart"/>
+            <w:r>
+              <w:rPr>
+                <w:rFonts w:ascii="Montserrat" w:eastAsia="Montserrat" w:hAnsi="Montserrat" w:cs="Montserrat"/>
+              </w:rPr>
+              <w:t>list</w:t>
+            </w:r>
+            <w:proofErr w:type="spellEnd"/>
+            <w:r>
+              <w:rPr>
+                <w:rFonts w:ascii="Montserrat" w:eastAsia="Montserrat" w:hAnsi="Montserrat" w:cs="Montserrat"/>
+              </w:rPr>
+              <w:t xml:space="preserve"> cuando no </w:t>
+            </w:r>
+            <w:proofErr w:type="spellStart"/>
+            <w:r>
+              <w:rPr>
+                <w:rFonts w:ascii="Montserrat" w:eastAsia="Montserrat" w:hAnsi="Montserrat" w:cs="Montserrat"/>
+              </w:rPr>
+              <w:t>esta</w:t>
+            </w:r>
+            <w:proofErr w:type="spellEnd"/>
+            <w:r>
+              <w:rPr>
+                <w:rFonts w:ascii="Montserrat" w:eastAsia="Montserrat" w:hAnsi="Montserrat" w:cs="Montserrat"/>
+              </w:rPr>
+              <w:t xml:space="preserve"> </w:t>
+            </w:r>
+            <w:proofErr w:type="spellStart"/>
+            <w:r>
+              <w:rPr>
+                <w:rFonts w:ascii="Montserrat" w:eastAsia="Montserrat" w:hAnsi="Montserrat" w:cs="Montserrat"/>
+              </w:rPr>
+              <w:t>logeado</w:t>
+            </w:r>
+            <w:proofErr w:type="spellEnd"/>
+            <w:r>
+              <w:rPr>
+                <w:rFonts w:ascii="Montserrat" w:eastAsia="Montserrat" w:hAnsi="Montserrat" w:cs="Montserrat"/>
+              </w:rPr>
+              <w:t>, o con otro rol distinto y no muestra la lista de los progresos.</w:t>
             </w:r>
           </w:p>
         </w:tc>
@@ -3749,6 +4612,7 @@
                 <w:rFonts w:ascii="Montserrat" w:eastAsia="Montserrat" w:hAnsi="Montserrat" w:cs="Montserrat"/>
               </w:rPr>
             </w:pPr>
+            <w:proofErr w:type="spellStart"/>
             <w:r>
               <w:rPr>
                 <w:rFonts w:ascii="Montserrat" w:eastAsia="Montserrat" w:hAnsi="Montserrat" w:cs="Montserrat"/>
@@ -3767,6 +4631,7 @@
               </w:rPr>
               <w:t>.hack</w:t>
             </w:r>
+            <w:proofErr w:type="spellEnd"/>
           </w:p>
         </w:tc>
         <w:tc>
@@ -3784,7 +4649,63 @@
               <w:rPr>
                 <w:rFonts w:ascii="Montserrat" w:eastAsia="Montserrat" w:hAnsi="Montserrat" w:cs="Montserrat"/>
               </w:rPr>
-              <w:t xml:space="preserve">Se hace client/progress/list-by-contract?contractId=438 Para usuario anonimo y </w:t>
+              <w:t xml:space="preserve">Se hace </w:t>
+            </w:r>
+            <w:proofErr w:type="spellStart"/>
+            <w:r>
+              <w:rPr>
+                <w:rFonts w:ascii="Montserrat" w:eastAsia="Montserrat" w:hAnsi="Montserrat" w:cs="Montserrat"/>
+              </w:rPr>
+              <w:t>client</w:t>
+            </w:r>
+            <w:proofErr w:type="spellEnd"/>
+            <w:r>
+              <w:rPr>
+                <w:rFonts w:ascii="Montserrat" w:eastAsia="Montserrat" w:hAnsi="Montserrat" w:cs="Montserrat"/>
+              </w:rPr>
+              <w:t>/</w:t>
+            </w:r>
+            <w:proofErr w:type="spellStart"/>
+            <w:r>
+              <w:rPr>
+                <w:rFonts w:ascii="Montserrat" w:eastAsia="Montserrat" w:hAnsi="Montserrat" w:cs="Montserrat"/>
+              </w:rPr>
+              <w:t>progress</w:t>
+            </w:r>
+            <w:proofErr w:type="spellEnd"/>
+            <w:r>
+              <w:rPr>
+                <w:rFonts w:ascii="Montserrat" w:eastAsia="Montserrat" w:hAnsi="Montserrat" w:cs="Montserrat"/>
+              </w:rPr>
+              <w:t>/</w:t>
+            </w:r>
+            <w:proofErr w:type="spellStart"/>
+            <w:r>
+              <w:rPr>
+                <w:rFonts w:ascii="Montserrat" w:eastAsia="Montserrat" w:hAnsi="Montserrat" w:cs="Montserrat"/>
+              </w:rPr>
+              <w:t>list-by-contract?contractId</w:t>
+            </w:r>
+            <w:proofErr w:type="spellEnd"/>
+            <w:r>
+              <w:rPr>
+                <w:rFonts w:ascii="Montserrat" w:eastAsia="Montserrat" w:hAnsi="Montserrat" w:cs="Montserrat"/>
+              </w:rPr>
+              <w:t xml:space="preserve">=438 Para usuario </w:t>
+            </w:r>
+            <w:proofErr w:type="spellStart"/>
+            <w:r>
+              <w:rPr>
+                <w:rFonts w:ascii="Montserrat" w:eastAsia="Montserrat" w:hAnsi="Montserrat" w:cs="Montserrat"/>
+              </w:rPr>
+              <w:t>anonimo</w:t>
+            </w:r>
+            <w:proofErr w:type="spellEnd"/>
+            <w:r>
+              <w:rPr>
+                <w:rFonts w:ascii="Montserrat" w:eastAsia="Montserrat" w:hAnsi="Montserrat" w:cs="Montserrat"/>
+              </w:rPr>
+              <w:t xml:space="preserve"> y </w:t>
             </w:r>
             <w:r>
               <w:rPr>
@@ -3819,12 +4740,14 @@
                 <w:rFonts w:ascii="Montserrat" w:eastAsia="Montserrat" w:hAnsi="Montserrat" w:cs="Montserrat"/>
               </w:rPr>
             </w:pPr>
+            <w:proofErr w:type="spellStart"/>
             <w:r>
               <w:rPr>
                 <w:rFonts w:ascii="Montserrat" w:eastAsia="Montserrat" w:hAnsi="Montserrat" w:cs="Montserrat"/>
               </w:rPr>
               <w:t>Publish.hack</w:t>
             </w:r>
+            <w:proofErr w:type="spellEnd"/>
           </w:p>
         </w:tc>
         <w:tc>
@@ -3842,13 +4765,83 @@
               <w:rPr>
                 <w:rFonts w:ascii="Montserrat" w:eastAsia="Montserrat" w:hAnsi="Montserrat" w:cs="Montserrat"/>
               </w:rPr>
-              <w:t>Se hace client/progress/publish?id=438 sin logear y</w:t>
-            </w:r>
-            <w:r>
-              <w:rPr>
-                <w:rFonts w:ascii="Montserrat" w:eastAsia="Montserrat" w:hAnsi="Montserrat" w:cs="Montserrat"/>
-              </w:rPr>
-              <w:t xml:space="preserve"> para gente con distintos roles y no deja publicar el progress log.</w:t>
+              <w:t xml:space="preserve">Se hace </w:t>
+            </w:r>
+            <w:proofErr w:type="spellStart"/>
+            <w:r>
+              <w:rPr>
+                <w:rFonts w:ascii="Montserrat" w:eastAsia="Montserrat" w:hAnsi="Montserrat" w:cs="Montserrat"/>
+              </w:rPr>
+              <w:t>client</w:t>
+            </w:r>
+            <w:proofErr w:type="spellEnd"/>
+            <w:r>
+              <w:rPr>
+                <w:rFonts w:ascii="Montserrat" w:eastAsia="Montserrat" w:hAnsi="Montserrat" w:cs="Montserrat"/>
+              </w:rPr>
+              <w:t>/</w:t>
+            </w:r>
+            <w:proofErr w:type="spellStart"/>
+            <w:r>
+              <w:rPr>
+                <w:rFonts w:ascii="Montserrat" w:eastAsia="Montserrat" w:hAnsi="Montserrat" w:cs="Montserrat"/>
+              </w:rPr>
+              <w:t>progress</w:t>
+            </w:r>
+            <w:proofErr w:type="spellEnd"/>
+            <w:r>
+              <w:rPr>
+                <w:rFonts w:ascii="Montserrat" w:eastAsia="Montserrat" w:hAnsi="Montserrat" w:cs="Montserrat"/>
+              </w:rPr>
+              <w:t>/</w:t>
+            </w:r>
+            <w:proofErr w:type="spellStart"/>
+            <w:r>
+              <w:rPr>
+                <w:rFonts w:ascii="Montserrat" w:eastAsia="Montserrat" w:hAnsi="Montserrat" w:cs="Montserrat"/>
+              </w:rPr>
+              <w:t>publish?id</w:t>
+            </w:r>
+            <w:proofErr w:type="spellEnd"/>
+            <w:r>
+              <w:rPr>
+                <w:rFonts w:ascii="Montserrat" w:eastAsia="Montserrat" w:hAnsi="Montserrat" w:cs="Montserrat"/>
+              </w:rPr>
+              <w:t xml:space="preserve">=438 sin </w:t>
+            </w:r>
+            <w:proofErr w:type="spellStart"/>
+            <w:r>
+              <w:rPr>
+                <w:rFonts w:ascii="Montserrat" w:eastAsia="Montserrat" w:hAnsi="Montserrat" w:cs="Montserrat"/>
+              </w:rPr>
+              <w:t>logear</w:t>
+            </w:r>
+            <w:proofErr w:type="spellEnd"/>
+            <w:r>
+              <w:rPr>
+                <w:rFonts w:ascii="Montserrat" w:eastAsia="Montserrat" w:hAnsi="Montserrat" w:cs="Montserrat"/>
+              </w:rPr>
+              <w:t xml:space="preserve"> y</w:t>
+            </w:r>
+            <w:r>
+              <w:rPr>
+                <w:rFonts w:ascii="Montserrat" w:eastAsia="Montserrat" w:hAnsi="Montserrat" w:cs="Montserrat"/>
+              </w:rPr>
+              <w:t xml:space="preserve"> para gente con distintos roles y no deja publicar el </w:t>
+            </w:r>
+            <w:proofErr w:type="spellStart"/>
+            <w:r>
+              <w:rPr>
+                <w:rFonts w:ascii="Montserrat" w:eastAsia="Montserrat" w:hAnsi="Montserrat" w:cs="Montserrat"/>
+              </w:rPr>
+              <w:t>progress</w:t>
+            </w:r>
+            <w:proofErr w:type="spellEnd"/>
+            <w:r>
+              <w:rPr>
+                <w:rFonts w:ascii="Montserrat" w:eastAsia="Montserrat" w:hAnsi="Montserrat" w:cs="Montserrat"/>
+              </w:rPr>
+              <w:t xml:space="preserve"> log.</w:t>
             </w:r>
           </w:p>
         </w:tc>
@@ -3865,12 +4858,14 @@
                 <w:rFonts w:ascii="Montserrat" w:eastAsia="Montserrat" w:hAnsi="Montserrat" w:cs="Montserrat"/>
               </w:rPr>
             </w:pPr>
+            <w:proofErr w:type="spellStart"/>
             <w:r>
               <w:rPr>
                 <w:rFonts w:ascii="Montserrat" w:eastAsia="Montserrat" w:hAnsi="Montserrat" w:cs="Montserrat"/>
               </w:rPr>
               <w:t>Delete.hack</w:t>
             </w:r>
+            <w:proofErr w:type="spellEnd"/>
           </w:p>
         </w:tc>
         <w:tc>
@@ -3894,7 +4889,35 @@
               <w:rPr>
                 <w:rFonts w:ascii="Montserrat" w:eastAsia="Montserrat" w:hAnsi="Montserrat" w:cs="Montserrat"/>
               </w:rPr>
-              <w:t>Se prueba a un progress log, para ello en el formulario se cambia la id por otro progress distinto. No deja</w:t>
+              <w:t xml:space="preserve">Se prueba a un </w:t>
+            </w:r>
+            <w:proofErr w:type="spellStart"/>
+            <w:r>
+              <w:rPr>
+                <w:rFonts w:ascii="Montserrat" w:eastAsia="Montserrat" w:hAnsi="Montserrat" w:cs="Montserrat"/>
+              </w:rPr>
+              <w:t>progress</w:t>
+            </w:r>
+            <w:proofErr w:type="spellEnd"/>
+            <w:r>
+              <w:rPr>
+                <w:rFonts w:ascii="Montserrat" w:eastAsia="Montserrat" w:hAnsi="Montserrat" w:cs="Montserrat"/>
+              </w:rPr>
+              <w:t xml:space="preserve"> log, para ello en el formulario se cambia la id por otro </w:t>
+            </w:r>
+            <w:proofErr w:type="spellStart"/>
+            <w:r>
+              <w:rPr>
+                <w:rFonts w:ascii="Montserrat" w:eastAsia="Montserrat" w:hAnsi="Montserrat" w:cs="Montserrat"/>
+              </w:rPr>
+              <w:t>progress</w:t>
+            </w:r>
+            <w:proofErr w:type="spellEnd"/>
+            <w:r>
+              <w:rPr>
+                <w:rFonts w:ascii="Montserrat" w:eastAsia="Montserrat" w:hAnsi="Montserrat" w:cs="Montserrat"/>
+              </w:rPr>
+              <w:t xml:space="preserve"> distinto. No deja</w:t>
             </w:r>
           </w:p>
         </w:tc>
@@ -3911,12 +4934,14 @@
                 <w:rFonts w:ascii="Montserrat" w:eastAsia="Montserrat" w:hAnsi="Montserrat" w:cs="Montserrat"/>
               </w:rPr>
             </w:pPr>
+            <w:proofErr w:type="spellStart"/>
             <w:r>
               <w:rPr>
                 <w:rFonts w:ascii="Montserrat" w:eastAsia="Montserrat" w:hAnsi="Montserrat" w:cs="Montserrat"/>
               </w:rPr>
               <w:t>Show.hack</w:t>
             </w:r>
+            <w:proofErr w:type="spellEnd"/>
           </w:p>
         </w:tc>
         <w:tc>
@@ -3934,7 +4959,35 @@
               <w:rPr>
                 <w:rFonts w:ascii="Montserrat" w:eastAsia="Montserrat" w:hAnsi="Montserrat" w:cs="Montserrat"/>
               </w:rPr>
-              <w:t>Se prueba a consultar un progress log sin logear, no deja.</w:t>
+              <w:t xml:space="preserve">Se prueba a consultar un </w:t>
+            </w:r>
+            <w:proofErr w:type="spellStart"/>
+            <w:r>
+              <w:rPr>
+                <w:rFonts w:ascii="Montserrat" w:eastAsia="Montserrat" w:hAnsi="Montserrat" w:cs="Montserrat"/>
+              </w:rPr>
+              <w:t>progress</w:t>
+            </w:r>
+            <w:proofErr w:type="spellEnd"/>
+            <w:r>
+              <w:rPr>
+                <w:rFonts w:ascii="Montserrat" w:eastAsia="Montserrat" w:hAnsi="Montserrat" w:cs="Montserrat"/>
+              </w:rPr>
+              <w:t xml:space="preserve"> log sin </w:t>
+            </w:r>
+            <w:proofErr w:type="spellStart"/>
+            <w:r>
+              <w:rPr>
+                <w:rFonts w:ascii="Montserrat" w:eastAsia="Montserrat" w:hAnsi="Montserrat" w:cs="Montserrat"/>
+              </w:rPr>
+              <w:t>logear</w:t>
+            </w:r>
+            <w:proofErr w:type="spellEnd"/>
+            <w:r>
+              <w:rPr>
+                <w:rFonts w:ascii="Montserrat" w:eastAsia="Montserrat" w:hAnsi="Montserrat" w:cs="Montserrat"/>
+              </w:rPr>
+              <w:t>, no deja.</w:t>
             </w:r>
           </w:p>
         </w:tc>
@@ -3951,6 +5004,7 @@
                 <w:rFonts w:ascii="Montserrat" w:eastAsia="Montserrat" w:hAnsi="Montserrat" w:cs="Montserrat"/>
               </w:rPr>
             </w:pPr>
+            <w:proofErr w:type="spellStart"/>
             <w:r>
               <w:rPr>
                 <w:rFonts w:ascii="Montserrat" w:eastAsia="Montserrat" w:hAnsi="Montserrat" w:cs="Montserrat"/>
@@ -3958,6 +5012,7 @@
               <w:lastRenderedPageBreak/>
               <w:t>Update.hack</w:t>
             </w:r>
+            <w:proofErr w:type="spellEnd"/>
           </w:p>
         </w:tc>
         <w:tc>
@@ -3981,7 +5036,49 @@
               <w:rPr>
                 <w:rFonts w:ascii="Montserrat" w:eastAsia="Montserrat" w:hAnsi="Montserrat" w:cs="Montserrat"/>
               </w:rPr>
-              <w:t>prueba a actualizar un progress log probando limites en el formulario y cambiando la id del formulario por otro progress log que no pertenece al usuario logeado. No deja</w:t>
+              <w:t xml:space="preserve">prueba a actualizar un </w:t>
+            </w:r>
+            <w:proofErr w:type="spellStart"/>
+            <w:r>
+              <w:rPr>
+                <w:rFonts w:ascii="Montserrat" w:eastAsia="Montserrat" w:hAnsi="Montserrat" w:cs="Montserrat"/>
+              </w:rPr>
+              <w:t>progress</w:t>
+            </w:r>
+            <w:proofErr w:type="spellEnd"/>
+            <w:r>
+              <w:rPr>
+                <w:rFonts w:ascii="Montserrat" w:eastAsia="Montserrat" w:hAnsi="Montserrat" w:cs="Montserrat"/>
+              </w:rPr>
+              <w:t xml:space="preserve"> log probando limites en el formulario y cambiando la id del formulario por otro </w:t>
+            </w:r>
+            <w:proofErr w:type="spellStart"/>
+            <w:r>
+              <w:rPr>
+                <w:rFonts w:ascii="Montserrat" w:eastAsia="Montserrat" w:hAnsi="Montserrat" w:cs="Montserrat"/>
+              </w:rPr>
+              <w:t>progress</w:t>
+            </w:r>
+            <w:proofErr w:type="spellEnd"/>
+            <w:r>
+              <w:rPr>
+                <w:rFonts w:ascii="Montserrat" w:eastAsia="Montserrat" w:hAnsi="Montserrat" w:cs="Montserrat"/>
+              </w:rPr>
+              <w:t xml:space="preserve"> log que no pertenece al usuario </w:t>
+            </w:r>
+            <w:proofErr w:type="spellStart"/>
+            <w:r>
+              <w:rPr>
+                <w:rFonts w:ascii="Montserrat" w:eastAsia="Montserrat" w:hAnsi="Montserrat" w:cs="Montserrat"/>
+              </w:rPr>
+              <w:t>logeado</w:t>
+            </w:r>
+            <w:proofErr w:type="spellEnd"/>
+            <w:r>
+              <w:rPr>
+                <w:rFonts w:ascii="Montserrat" w:eastAsia="Montserrat" w:hAnsi="Montserrat" w:cs="Montserrat"/>
+              </w:rPr>
+              <w:t>. No deja</w:t>
             </w:r>
           </w:p>
         </w:tc>
@@ -4018,7 +5115,63 @@
         <w:rPr>
           <w:rFonts w:ascii="Montserrat" w:eastAsia="Montserrat" w:hAnsi="Montserrat" w:cs="Montserrat"/>
         </w:rPr>
-        <w:t xml:space="preserve"> se ha abordado una gran variedad de casos posibles, en el coverage de las pruebas podemos observar mas de un 90 % de coverage en todos los servicios relacionados a los requisitos que ha pedido el cliente para el student 2.</w:t>
+        <w:t xml:space="preserve"> se ha abordado una gran variedad de casos posibles, en el </w:t>
+      </w:r>
+      <w:proofErr w:type="spellStart"/>
+      <w:r>
+        <w:rPr>
+          <w:rFonts w:ascii="Montserrat" w:eastAsia="Montserrat" w:hAnsi="Montserrat" w:cs="Montserrat"/>
+        </w:rPr>
+        <w:t>coverage</w:t>
+      </w:r>
+      <w:proofErr w:type="spellEnd"/>
+      <w:r>
+        <w:rPr>
+          <w:rFonts w:ascii="Montserrat" w:eastAsia="Montserrat" w:hAnsi="Montserrat" w:cs="Montserrat"/>
+        </w:rPr>
+        <w:t xml:space="preserve"> de las pruebas podemos observar </w:t>
+      </w:r>
+      <w:proofErr w:type="spellStart"/>
+      <w:r>
+        <w:rPr>
+          <w:rFonts w:ascii="Montserrat" w:eastAsia="Montserrat" w:hAnsi="Montserrat" w:cs="Montserrat"/>
+        </w:rPr>
+        <w:t>mas</w:t>
+      </w:r>
+      <w:proofErr w:type="spellEnd"/>
+      <w:r>
+        <w:rPr>
+          <w:rFonts w:ascii="Montserrat" w:eastAsia="Montserrat" w:hAnsi="Montserrat" w:cs="Montserrat"/>
+        </w:rPr>
+        <w:t xml:space="preserve"> de un 90 % de </w:t>
+      </w:r>
+      <w:proofErr w:type="spellStart"/>
+      <w:r>
+        <w:rPr>
+          <w:rFonts w:ascii="Montserrat" w:eastAsia="Montserrat" w:hAnsi="Montserrat" w:cs="Montserrat"/>
+        </w:rPr>
+        <w:t>coverage</w:t>
+      </w:r>
+      <w:proofErr w:type="spellEnd"/>
+      <w:r>
+        <w:rPr>
+          <w:rFonts w:ascii="Montserrat" w:eastAsia="Montserrat" w:hAnsi="Montserrat" w:cs="Montserrat"/>
+        </w:rPr>
+        <w:t xml:space="preserve"> en todos los servicios relacionados a los requisitos que ha pedido el cliente para el </w:t>
+      </w:r>
+      <w:proofErr w:type="spellStart"/>
+      <w:r>
+        <w:rPr>
+          <w:rFonts w:ascii="Montserrat" w:eastAsia="Montserrat" w:hAnsi="Montserrat" w:cs="Montserrat"/>
+        </w:rPr>
+        <w:t>student</w:t>
+      </w:r>
+      <w:proofErr w:type="spellEnd"/>
+      <w:r>
+        <w:rPr>
+          <w:rFonts w:ascii="Montserrat" w:eastAsia="Montserrat" w:hAnsi="Montserrat" w:cs="Montserrat"/>
+        </w:rPr>
+        <w:t xml:space="preserve"> 2.</w:t>
       </w:r>
     </w:p>
     <w:p>
@@ -4294,7 +5447,7 @@
           <w:noProof/>
         </w:rPr>
         <w:drawing>
-          <wp:inline distT="0" distB="0" distL="0" distR="0" wp14:anchorId="28DF3AEE" wp14:editId="34E068D7">
+          <wp:inline distT="0" distB="0" distL="0" distR="0" wp14:anchorId="28DF3AEE" wp14:editId="1D3434C1">
             <wp:extent cx="5723890" cy="2019935"/>
             <wp:effectExtent l="0" t="0" r="0" b="0"/>
             <wp:docPr id="562339335" name="Imagen 3"/>
@@ -4361,7 +5514,15 @@
         <w:t xml:space="preserve"> por lo general tiene tiempos más bajos</w:t>
       </w:r>
       <w:r>
-        <w:t xml:space="preserve">, observamos que la request que tarda </w:t>
+        <w:t xml:space="preserve">, observamos que la </w:t>
+      </w:r>
+      <w:proofErr w:type="spellStart"/>
+      <w:r>
+        <w:t>request</w:t>
+      </w:r>
+      <w:proofErr w:type="spellEnd"/>
+      <w:r>
+        <w:t xml:space="preserve"> que tarda </w:t>
       </w:r>
       <w:r>
         <w:t>más</w:t>
@@ -4376,8 +5537,13 @@
         <w:t xml:space="preserve"> datos se tienen que </w:t>
       </w:r>
       <w:r>
-        <w:t>traer desde el backend</w:t>
-      </w:r>
+        <w:t xml:space="preserve">traer desde el </w:t>
+      </w:r>
+      <w:proofErr w:type="spellStart"/>
+      <w:r>
+        <w:t>backend</w:t>
+      </w:r>
+      <w:proofErr w:type="spellEnd"/>
       <w:r>
         <w:t xml:space="preserve"> y por lo tanto </w:t>
       </w:r>
@@ -4520,8 +5686,6 @@
         <w:pStyle w:val="Ttulo1"/>
         <w:spacing w:before="320" w:after="320" w:line="360" w:lineRule="auto"/>
         <w:rPr>
-          <w:b/>
-          <w:bCs/>
           <w:sz w:val="26"/>
           <w:szCs w:val="26"/>
         </w:rPr>
@@ -4601,22 +5765,21 @@
           <w:sz w:val="22"/>
           <w:szCs w:val="22"/>
         </w:rPr>
-        <w:t>). Son intervalos aceptables.</w:t>
-      </w:r>
-      <w:r>
-        <w:rPr>
-          <w:b/>
-          <w:bCs/>
-          <w:sz w:val="26"/>
-          <w:szCs w:val="26"/>
-        </w:rPr>
-        <w:t xml:space="preserve"> </w:t>
+        <w:t>). Son intervalos aceptable</w:t>
+      </w:r>
+      <w:r>
+        <w:rPr>
+          <w:sz w:val="22"/>
+          <w:szCs w:val="22"/>
+        </w:rPr>
+        <w:t>s. Estos intervalos significan que si volvemos a ejecutar las pruebas en el ordenador en concreto, en un 95% de las veces la media va a salir en el intervalo de ese pc.</w:t>
       </w:r>
     </w:p>
     <w:p/>
     <w:p/>
     <w:p>
       <w:r>
+        <w:lastRenderedPageBreak/>
         <w:t>A continuación, calculamos la hipótesis de contraste con 95% confianza para intentar averiguar que ordenador es más potente:</w:t>
       </w:r>
       <w:r>
@@ -4625,7 +5788,6 @@
     </w:p>
     <w:p>
       <w:r>
-        <w:lastRenderedPageBreak/>
         <w:t>Este se basa en un valor llamado alfa, que se calcula como 1 menos el porcentaje del nivel de confianza. Para este caso, alfa será 0.05.</w:t>
       </w:r>
     </w:p>
@@ -4739,10 +5901,44 @@
         <w:t xml:space="preserve">4 </w:t>
       </w:r>
       <w:r>
-        <w:t>que es mayor que alfa (0.05) pero no es un valor que concluya que hay una diferencia significativa entre los dos pcs. Si bien es cierto que siempre va a haber una diferencia entre ambos, los consideramos como equivalentes en general.</w:t>
+        <w:t xml:space="preserve">que es mayor que alfa (0.05) pero no es un valor que concluya que hay una diferencia significativa entre los dos </w:t>
+      </w:r>
+      <w:proofErr w:type="spellStart"/>
+      <w:r>
+        <w:t>pcs</w:t>
+      </w:r>
+      <w:proofErr w:type="spellEnd"/>
+      <w:r>
+        <w:t>. Si bien es cierto que siempre va a haber una diferencia entre ambos, los consideramos como equivalentes en general</w:t>
+      </w:r>
+      <w:r>
+        <w:t>.</w:t>
       </w:r>
     </w:p>
     <w:p/>
+    <w:p>
+      <w:r>
+        <w:t>Si p≤α, se rechaza la hipótesis nula H y se concluye que hay suficiente evidencia para decir que hay una diferencia significativa entre las dos muestras</w:t>
+      </w:r>
+    </w:p>
+    <w:p/>
+    <w:p>
+      <w:r>
+        <w:t>•  Si p&gt; α, no se rechaza la hipótesis nula H y se concluye que no hay suficiente evidencia para decir que hay una diferencia significativa entre las dos muestras.</w:t>
+      </w:r>
+    </w:p>
+    <w:p/>
+    <w:p/>
+    <w:p>
+      <w:r>
+        <w:rPr>
+          <w:rFonts w:ascii="Times New Roman" w:eastAsia="Times New Roman" w:hAnsi="Symbol" w:cs="Times New Roman"/>
+          <w:sz w:val="24"/>
+          <w:szCs w:val="24"/>
+        </w:rPr>
+        <w:t>ç</w:t>
+      </w:r>
+    </w:p>
     <w:p>
       <w:pPr>
         <w:pStyle w:val="Ttulo1"/>
@@ -4754,6 +5950,7 @@
         </w:rPr>
       </w:pPr>
       <w:r>
+        <w:lastRenderedPageBreak/>
         <w:t>5. Conclusiones</w:t>
       </w:r>
       <w:bookmarkEnd w:id="5"/>
@@ -6252,6 +7449,16 @@
     <w:basedOn w:val="Fuentedeprrafopredeter"/>
     <w:rsid w:val="001A3B46"/>
   </w:style>
+  <w:style w:type="character" w:customStyle="1" w:styleId="mrel">
+    <w:name w:val="mrel"/>
+    <w:basedOn w:val="Fuentedeprrafopredeter"/>
+    <w:rsid w:val="008A1B5D"/>
+  </w:style>
+  <w:style w:type="character" w:customStyle="1" w:styleId="vlist-s">
+    <w:name w:val="vlist-s"/>
+    <w:basedOn w:val="Fuentedeprrafopredeter"/>
+    <w:rsid w:val="008A1B5D"/>
+  </w:style>
 </w:styles>
 </file>
 

</xml_diff>